<commit_message>
Fix some errors in code screenshots in the lab doc. Add lab doc pdf
</commit_message>
<xml_diff>
--- a/BicycleModelLab-22July2026.docx
+++ b/BicycleModelLab-22July2026.docx
@@ -198,7 +198,7 @@
           <w:r>
             <w:fldChar w:fldCharType="separate"/>
           </w:r>
-          <w:hyperlink w:anchor="_Toc235630483" w:history="1">
+          <w:hyperlink w:anchor="_Toc235573149" w:history="1">
             <w:r>
               <w:rPr>
                 <w:rStyle w:val="Hyperlink"/>
@@ -225,7 +225,7 @@
                 <w:noProof/>
                 <w:webHidden/>
               </w:rPr>
-              <w:instrText xml:space="preserve"> PAGEREF _Toc235630483 \h </w:instrText>
+              <w:instrText xml:space="preserve"> PAGEREF _Toc235573149 \h </w:instrText>
             </w:r>
             <w:r>
               <w:rPr>
@@ -268,7 +268,7 @@
               <w:lang w:eastAsia="en-CA"/>
             </w:rPr>
           </w:pPr>
-          <w:hyperlink w:anchor="_Toc235630484" w:history="1">
+          <w:hyperlink w:anchor="_Toc235573150" w:history="1">
             <w:r>
               <w:rPr>
                 <w:rStyle w:val="Hyperlink"/>
@@ -295,7 +295,7 @@
                 <w:noProof/>
                 <w:webHidden/>
               </w:rPr>
-              <w:instrText xml:space="preserve"> PAGEREF _Toc235630484 \h </w:instrText>
+              <w:instrText xml:space="preserve"> PAGEREF _Toc235573150 \h </w:instrText>
             </w:r>
             <w:r>
               <w:rPr>
@@ -338,7 +338,7 @@
               <w:lang w:eastAsia="en-CA"/>
             </w:rPr>
           </w:pPr>
-          <w:hyperlink w:anchor="_Toc235630485" w:history="1">
+          <w:hyperlink w:anchor="_Toc235573151" w:history="1">
             <w:r>
               <w:rPr>
                 <w:rStyle w:val="Hyperlink"/>
@@ -365,7 +365,7 @@
                 <w:noProof/>
                 <w:webHidden/>
               </w:rPr>
-              <w:instrText xml:space="preserve"> PAGEREF _Toc235630485 \h </w:instrText>
+              <w:instrText xml:space="preserve"> PAGEREF _Toc235573151 \h </w:instrText>
             </w:r>
             <w:r>
               <w:rPr>
@@ -408,7 +408,7 @@
               <w:lang w:eastAsia="en-CA"/>
             </w:rPr>
           </w:pPr>
-          <w:hyperlink w:anchor="_Toc235630486" w:history="1">
+          <w:hyperlink w:anchor="_Toc235573152" w:history="1">
             <w:r>
               <w:rPr>
                 <w:rStyle w:val="Hyperlink"/>
@@ -435,7 +435,7 @@
                 <w:noProof/>
                 <w:webHidden/>
               </w:rPr>
-              <w:instrText xml:space="preserve"> PAGEREF _Toc235630486 \h </w:instrText>
+              <w:instrText xml:space="preserve"> PAGEREF _Toc235573152 \h </w:instrText>
             </w:r>
             <w:r>
               <w:rPr>
@@ -478,7 +478,7 @@
               <w:lang w:eastAsia="en-CA"/>
             </w:rPr>
           </w:pPr>
-          <w:hyperlink w:anchor="_Toc235630487" w:history="1">
+          <w:hyperlink w:anchor="_Toc235573153" w:history="1">
             <w:r>
               <w:rPr>
                 <w:rStyle w:val="Hyperlink"/>
@@ -505,7 +505,7 @@
                 <w:noProof/>
                 <w:webHidden/>
               </w:rPr>
-              <w:instrText xml:space="preserve"> PAGEREF _Toc235630487 \h </w:instrText>
+              <w:instrText xml:space="preserve"> PAGEREF _Toc235573153 \h </w:instrText>
             </w:r>
             <w:r>
               <w:rPr>
@@ -548,7 +548,7 @@
               <w:lang w:eastAsia="en-CA"/>
             </w:rPr>
           </w:pPr>
-          <w:hyperlink w:anchor="_Toc235630488" w:history="1">
+          <w:hyperlink w:anchor="_Toc235573154" w:history="1">
             <w:r>
               <w:rPr>
                 <w:rStyle w:val="Hyperlink"/>
@@ -575,7 +575,7 @@
                 <w:noProof/>
                 <w:webHidden/>
               </w:rPr>
-              <w:instrText xml:space="preserve"> PAGEREF _Toc235630488 \h </w:instrText>
+              <w:instrText xml:space="preserve"> PAGEREF _Toc235573154 \h </w:instrText>
             </w:r>
             <w:r>
               <w:rPr>
@@ -618,7 +618,7 @@
               <w:lang w:eastAsia="en-CA"/>
             </w:rPr>
           </w:pPr>
-          <w:hyperlink w:anchor="_Toc235630489" w:history="1">
+          <w:hyperlink w:anchor="_Toc235573155" w:history="1">
             <w:r>
               <w:rPr>
                 <w:rStyle w:val="Hyperlink"/>
@@ -645,7 +645,7 @@
                 <w:noProof/>
                 <w:webHidden/>
               </w:rPr>
-              <w:instrText xml:space="preserve"> PAGEREF _Toc235630489 \h </w:instrText>
+              <w:instrText xml:space="preserve"> PAGEREF _Toc235573155 \h </w:instrText>
             </w:r>
             <w:r>
               <w:rPr>
@@ -688,7 +688,7 @@
               <w:lang w:eastAsia="en-CA"/>
             </w:rPr>
           </w:pPr>
-          <w:hyperlink w:anchor="_Toc235630490" w:history="1">
+          <w:hyperlink w:anchor="_Toc235573156" w:history="1">
             <w:r>
               <w:rPr>
                 <w:rStyle w:val="Hyperlink"/>
@@ -715,7 +715,7 @@
                 <w:noProof/>
                 <w:webHidden/>
               </w:rPr>
-              <w:instrText xml:space="preserve"> PAGEREF _Toc235630490 \h </w:instrText>
+              <w:instrText xml:space="preserve"> PAGEREF _Toc235573156 \h </w:instrText>
             </w:r>
             <w:r>
               <w:rPr>
@@ -758,7 +758,7 @@
               <w:lang w:eastAsia="en-CA"/>
             </w:rPr>
           </w:pPr>
-          <w:hyperlink w:anchor="_Toc235630491" w:history="1">
+          <w:hyperlink w:anchor="_Toc235573157" w:history="1">
             <w:r>
               <w:rPr>
                 <w:rStyle w:val="Hyperlink"/>
@@ -785,7 +785,7 @@
                 <w:noProof/>
                 <w:webHidden/>
               </w:rPr>
-              <w:instrText xml:space="preserve"> PAGEREF _Toc235630491 \h </w:instrText>
+              <w:instrText xml:space="preserve"> PAGEREF _Toc235573157 \h </w:instrText>
             </w:r>
             <w:r>
               <w:rPr>
@@ -828,7 +828,7 @@
               <w:lang w:eastAsia="en-CA"/>
             </w:rPr>
           </w:pPr>
-          <w:hyperlink w:anchor="_Toc235630492" w:history="1">
+          <w:hyperlink w:anchor="_Toc235573158" w:history="1">
             <w:r>
               <w:rPr>
                 <w:rStyle w:val="Hyperlink"/>
@@ -855,7 +855,7 @@
                 <w:noProof/>
                 <w:webHidden/>
               </w:rPr>
-              <w:instrText xml:space="preserve"> PAGEREF _Toc235630492 \h </w:instrText>
+              <w:instrText xml:space="preserve"> PAGEREF _Toc235573158 \h </w:instrText>
             </w:r>
             <w:r>
               <w:rPr>
@@ -898,7 +898,7 @@
               <w:lang w:eastAsia="en-CA"/>
             </w:rPr>
           </w:pPr>
-          <w:hyperlink w:anchor="_Toc235630493" w:history="1">
+          <w:hyperlink w:anchor="_Toc235573159" w:history="1">
             <w:r>
               <w:rPr>
                 <w:rStyle w:val="Hyperlink"/>
@@ -925,7 +925,7 @@
                 <w:noProof/>
                 <w:webHidden/>
               </w:rPr>
-              <w:instrText xml:space="preserve"> PAGEREF _Toc235630493 \h </w:instrText>
+              <w:instrText xml:space="preserve"> PAGEREF _Toc235573159 \h </w:instrText>
             </w:r>
             <w:r>
               <w:rPr>
@@ -968,7 +968,7 @@
               <w:lang w:eastAsia="en-CA"/>
             </w:rPr>
           </w:pPr>
-          <w:hyperlink w:anchor="_Toc235630494" w:history="1">
+          <w:hyperlink w:anchor="_Toc235573160" w:history="1">
             <w:r>
               <w:rPr>
                 <w:rStyle w:val="Hyperlink"/>
@@ -995,7 +995,7 @@
                 <w:noProof/>
                 <w:webHidden/>
               </w:rPr>
-              <w:instrText xml:space="preserve"> PAGEREF _Toc235630494 \h </w:instrText>
+              <w:instrText xml:space="preserve"> PAGEREF _Toc235573160 \h </w:instrText>
             </w:r>
             <w:r>
               <w:rPr>
@@ -1038,7 +1038,7 @@
               <w:lang w:eastAsia="en-CA"/>
             </w:rPr>
           </w:pPr>
-          <w:hyperlink w:anchor="_Toc235630495" w:history="1">
+          <w:hyperlink w:anchor="_Toc235573161" w:history="1">
             <w:r>
               <w:rPr>
                 <w:rStyle w:val="Hyperlink"/>
@@ -1065,7 +1065,7 @@
                 <w:noProof/>
                 <w:webHidden/>
               </w:rPr>
-              <w:instrText xml:space="preserve"> PAGEREF _Toc235630495 \h </w:instrText>
+              <w:instrText xml:space="preserve"> PAGEREF _Toc235573161 \h </w:instrText>
             </w:r>
             <w:r>
               <w:rPr>
@@ -1108,7 +1108,7 @@
               <w:lang w:eastAsia="en-CA"/>
             </w:rPr>
           </w:pPr>
-          <w:hyperlink w:anchor="_Toc235630496" w:history="1">
+          <w:hyperlink w:anchor="_Toc235573162" w:history="1">
             <w:r>
               <w:rPr>
                 <w:rStyle w:val="Hyperlink"/>
@@ -1135,7 +1135,7 @@
                 <w:noProof/>
                 <w:webHidden/>
               </w:rPr>
-              <w:instrText xml:space="preserve"> PAGEREF _Toc235630496 \h </w:instrText>
+              <w:instrText xml:space="preserve"> PAGEREF _Toc235573162 \h </w:instrText>
             </w:r>
             <w:r>
               <w:rPr>
@@ -1178,7 +1178,7 @@
               <w:lang w:eastAsia="en-CA"/>
             </w:rPr>
           </w:pPr>
-          <w:hyperlink w:anchor="_Toc235630497" w:history="1">
+          <w:hyperlink w:anchor="_Toc235573163" w:history="1">
             <w:r>
               <w:rPr>
                 <w:rStyle w:val="Hyperlink"/>
@@ -1205,7 +1205,7 @@
                 <w:noProof/>
                 <w:webHidden/>
               </w:rPr>
-              <w:instrText xml:space="preserve"> PAGEREF _Toc235630497 \h </w:instrText>
+              <w:instrText xml:space="preserve"> PAGEREF _Toc235573163 \h </w:instrText>
             </w:r>
             <w:r>
               <w:rPr>
@@ -1248,13 +1248,13 @@
               <w:lang w:eastAsia="en-CA"/>
             </w:rPr>
           </w:pPr>
-          <w:hyperlink w:anchor="_Toc235630498" w:history="1">
+          <w:hyperlink w:anchor="_Toc235573164" w:history="1">
             <w:r>
               <w:rPr>
                 <w:rStyle w:val="Hyperlink"/>
                 <w:noProof/>
               </w:rPr>
-              <w:t>Virtual Model</w:t>
+              <w:t>Programming</w:t>
             </w:r>
             <w:r>
               <w:rPr>
@@ -1275,7 +1275,7 @@
                 <w:noProof/>
                 <w:webHidden/>
               </w:rPr>
-              <w:instrText xml:space="preserve"> PAGEREF _Toc235630498 \h </w:instrText>
+              <w:instrText xml:space="preserve"> PAGEREF _Toc235573164 \h </w:instrText>
             </w:r>
             <w:r>
               <w:rPr>
@@ -1318,13 +1318,13 @@
               <w:lang w:eastAsia="en-CA"/>
             </w:rPr>
           </w:pPr>
-          <w:hyperlink w:anchor="_Toc235630499" w:history="1">
+          <w:hyperlink w:anchor="_Toc235573165" w:history="1">
             <w:r>
               <w:rPr>
                 <w:rStyle w:val="Hyperlink"/>
                 <w:noProof/>
               </w:rPr>
-              <w:t>Influence of Center of Gravity Location</w:t>
+              <w:t>References</w:t>
             </w:r>
             <w:r>
               <w:rPr>
@@ -1345,7 +1345,7 @@
                 <w:noProof/>
                 <w:webHidden/>
               </w:rPr>
-              <w:instrText xml:space="preserve"> PAGEREF _Toc235630499 \h </w:instrText>
+              <w:instrText xml:space="preserve"> PAGEREF _Toc235573165 \h </w:instrText>
             </w:r>
             <w:r>
               <w:rPr>
@@ -1365,147 +1365,7 @@
                 <w:noProof/>
                 <w:webHidden/>
               </w:rPr>
-              <w:t>20</w:t>
-            </w:r>
-            <w:r>
-              <w:rPr>
-                <w:noProof/>
-                <w:webHidden/>
-              </w:rPr>
-              <w:fldChar w:fldCharType="end"/>
-            </w:r>
-          </w:hyperlink>
-        </w:p>
-        <w:p>
-          <w:pPr>
-            <w:pStyle w:val="TOC1"/>
-            <w:tabs>
-              <w:tab w:val="right" w:leader="dot" w:pos="9350"/>
-            </w:tabs>
-            <w:rPr>
-              <w:rFonts w:eastAsiaTheme="minorEastAsia"/>
-              <w:noProof/>
-              <w:lang w:eastAsia="en-CA"/>
-            </w:rPr>
-          </w:pPr>
-          <w:hyperlink w:anchor="_Toc235630500" w:history="1">
-            <w:r>
-              <w:rPr>
-                <w:rStyle w:val="Hyperlink"/>
-                <w:noProof/>
-              </w:rPr>
-              <w:t>Reflection Questions</w:t>
-            </w:r>
-            <w:r>
-              <w:rPr>
-                <w:noProof/>
-                <w:webHidden/>
-              </w:rPr>
-              <w:tab/>
-            </w:r>
-            <w:r>
-              <w:rPr>
-                <w:noProof/>
-                <w:webHidden/>
-              </w:rPr>
-              <w:fldChar w:fldCharType="begin"/>
-            </w:r>
-            <w:r>
-              <w:rPr>
-                <w:noProof/>
-                <w:webHidden/>
-              </w:rPr>
-              <w:instrText xml:space="preserve"> PAGEREF _Toc235630500 \h </w:instrText>
-            </w:r>
-            <w:r>
-              <w:rPr>
-                <w:noProof/>
-                <w:webHidden/>
-              </w:rPr>
-            </w:r>
-            <w:r>
-              <w:rPr>
-                <w:noProof/>
-                <w:webHidden/>
-              </w:rPr>
-              <w:fldChar w:fldCharType="separate"/>
-            </w:r>
-            <w:r>
-              <w:rPr>
-                <w:noProof/>
-                <w:webHidden/>
-              </w:rPr>
-              <w:t>23</w:t>
-            </w:r>
-            <w:r>
-              <w:rPr>
-                <w:noProof/>
-                <w:webHidden/>
-              </w:rPr>
-              <w:fldChar w:fldCharType="end"/>
-            </w:r>
-          </w:hyperlink>
-        </w:p>
-        <w:p>
-          <w:pPr>
-            <w:pStyle w:val="TOC1"/>
-            <w:tabs>
-              <w:tab w:val="right" w:leader="dot" w:pos="9350"/>
-            </w:tabs>
-            <w:rPr>
-              <w:rFonts w:eastAsiaTheme="minorEastAsia"/>
-              <w:noProof/>
-              <w:lang w:eastAsia="en-CA"/>
-            </w:rPr>
-          </w:pPr>
-          <w:hyperlink w:anchor="_Toc235630501" w:history="1">
-            <w:r>
-              <w:rPr>
-                <w:rStyle w:val="Hyperlink"/>
-                <w:noProof/>
-              </w:rPr>
-              <w:t>References</w:t>
-            </w:r>
-            <w:r>
-              <w:rPr>
-                <w:noProof/>
-                <w:webHidden/>
-              </w:rPr>
-              <w:tab/>
-            </w:r>
-            <w:r>
-              <w:rPr>
-                <w:noProof/>
-                <w:webHidden/>
-              </w:rPr>
-              <w:fldChar w:fldCharType="begin"/>
-            </w:r>
-            <w:r>
-              <w:rPr>
-                <w:noProof/>
-                <w:webHidden/>
-              </w:rPr>
-              <w:instrText xml:space="preserve"> PAGEREF _Toc235630501 \h </w:instrText>
-            </w:r>
-            <w:r>
-              <w:rPr>
-                <w:noProof/>
-                <w:webHidden/>
-              </w:rPr>
-            </w:r>
-            <w:r>
-              <w:rPr>
-                <w:noProof/>
-                <w:webHidden/>
-              </w:rPr>
-              <w:fldChar w:fldCharType="separate"/>
-            </w:r>
-            <w:r>
-              <w:rPr>
-                <w:noProof/>
-                <w:webHidden/>
-              </w:rPr>
-              <w:t>24</w:t>
+              <w:t>21</w:t>
             </w:r>
             <w:r>
               <w:rPr>
@@ -1544,7 +1404,7 @@
       <w:pPr>
         <w:pStyle w:val="Heading1"/>
       </w:pPr>
-      <w:bookmarkStart w:id="0" w:name="_Toc235630483"/>
+      <w:bookmarkStart w:id="0" w:name="_Toc235573149"/>
       <w:r>
         <w:lastRenderedPageBreak/>
         <w:t>Learning Outcomes</w:t>
@@ -1735,7 +1595,7 @@
       <w:pPr>
         <w:pStyle w:val="Heading2"/>
       </w:pPr>
-      <w:bookmarkStart w:id="1" w:name="_Toc235630484"/>
+      <w:bookmarkStart w:id="1" w:name="_Toc235573150"/>
       <w:r>
         <w:t>Requirements</w:t>
       </w:r>
@@ -1863,7 +1723,7 @@
       <w:r>
         <w:br w:type="page"/>
       </w:r>
-      <w:bookmarkStart w:id="2" w:name="_Toc235630485"/>
+      <w:bookmarkStart w:id="2" w:name="_Toc235573151"/>
       <w:r>
         <w:lastRenderedPageBreak/>
         <w:t xml:space="preserve">Lateral </w:t>
@@ -2010,7 +1870,7 @@
       <w:pPr>
         <w:pStyle w:val="Heading2"/>
       </w:pPr>
-      <w:bookmarkStart w:id="3" w:name="_Toc235630486"/>
+      <w:bookmarkStart w:id="3" w:name="_Toc235573152"/>
       <w:r>
         <w:t>MATLAB Tire Model</w:t>
       </w:r>
@@ -2036,59 +1896,20 @@
         <w:t xml:space="preserve">(MF) </w:t>
       </w:r>
       <w:r>
-        <w:t>(also known as “Swift”, “</w:t>
-      </w:r>
-      <w:proofErr w:type="spellStart"/>
-      <w:r>
-        <w:t>Pacejka</w:t>
-      </w:r>
-      <w:proofErr w:type="spellEnd"/>
-      <w:r>
-        <w:t xml:space="preserve">”) tire model. A file </w:t>
-      </w:r>
-      <w:r>
-        <w:t>called “</w:t>
-      </w:r>
-      <w:proofErr w:type="spellStart"/>
-      <w:r>
-        <w:t>magicformula.m</w:t>
-      </w:r>
-      <w:proofErr w:type="spellEnd"/>
-      <w:r>
-        <w:t xml:space="preserve">” is provided for you. This file </w:t>
-      </w:r>
-      <w:r>
-        <w:t>implements the MF equations for longitudinal force (</w:t>
-      </w:r>
-      <w:proofErr w:type="spellStart"/>
-      <w:r>
-        <w:t>Fx</w:t>
-      </w:r>
-      <w:proofErr w:type="spellEnd"/>
-      <w:r>
-        <w:t>), lateral force (Fy), and aligning moment (</w:t>
-      </w:r>
-      <w:proofErr w:type="spellStart"/>
-      <w:r>
-        <w:t>Mz</w:t>
-      </w:r>
-      <w:proofErr w:type="spellEnd"/>
-      <w:r>
-        <w:t xml:space="preserve">). </w:t>
-      </w:r>
-      <w:r>
-        <w:t xml:space="preserve">The coefficients for the MF equations are typically stored in a </w:t>
-      </w:r>
-      <w:proofErr w:type="gramStart"/>
-      <w:r>
-        <w:t>“.</w:t>
-      </w:r>
-      <w:proofErr w:type="spellStart"/>
+        <w:t xml:space="preserve">(also known as “Swift”, “Pacejka”) tire model. A file </w:t>
+      </w:r>
+      <w:r>
+        <w:t xml:space="preserve">called “magicformula.m” is provided for you. This file </w:t>
+      </w:r>
+      <w:r>
+        <w:t xml:space="preserve">implements the MF equations for longitudinal force (Fx), lateral force (Fy), and aligning moment (Mz). </w:t>
+      </w:r>
+      <w:r>
+        <w:t>The coefficients for the MF equations are typically stored in a “.</w:t>
+      </w:r>
       <w:r>
         <w:t>tir</w:t>
       </w:r>
-      <w:proofErr w:type="spellEnd"/>
-      <w:proofErr w:type="gramEnd"/>
       <w:r>
         <w:t>” file. A file for the current tires on the FSAE car has been provided for you</w:t>
       </w:r>
@@ -2096,38 +1917,17 @@
         <w:t>: “</w:t>
       </w:r>
       <w:r>
-        <w:t xml:space="preserve">Hoosier 43100 18.0x6.0-10 R20 7in </w:t>
-      </w:r>
-      <w:proofErr w:type="spellStart"/>
-      <w:r>
-        <w:t>Rim.</w:t>
-      </w:r>
-      <w:r>
-        <w:t>tir</w:t>
-      </w:r>
-      <w:proofErr w:type="spellEnd"/>
-      <w:r>
-        <w:t xml:space="preserve">”. The coefficients in the </w:t>
-      </w:r>
-      <w:r>
-        <w:t>.</w:t>
-      </w:r>
-      <w:proofErr w:type="spellStart"/>
-      <w:r>
-        <w:t>tir</w:t>
-      </w:r>
-      <w:proofErr w:type="spellEnd"/>
-      <w:r>
-        <w:t xml:space="preserve"> file have been extracted to the .mat file (also provided): “</w:t>
-      </w:r>
-      <w:r>
-        <w:t xml:space="preserve">Hoosier 43100 18.0x6.0-10 R20 7in </w:t>
-      </w:r>
-      <w:proofErr w:type="spellStart"/>
-      <w:r>
-        <w:t>Rim.mat</w:t>
-      </w:r>
-      <w:proofErr w:type="spellEnd"/>
+        <w:t>Hoosier 43100 18.0x6.0-10 R20 7in Rim.</w:t>
+      </w:r>
+      <w:r>
+        <w:t xml:space="preserve">tir”. The coefficients in the </w:t>
+      </w:r>
+      <w:r>
+        <w:t>.tir file have been extracted to the .mat file (also provided): “</w:t>
+      </w:r>
+      <w:r>
+        <w:t>Hoosier 43100 18.0x6.0-10 R20 7in Rim.mat</w:t>
+      </w:r>
       <w:r>
         <w:t xml:space="preserve">”. </w:t>
       </w:r>
@@ -2136,15 +1936,10 @@
       <w:pPr>
         <w:pStyle w:val="Heading3"/>
       </w:pPr>
-      <w:bookmarkStart w:id="4" w:name="_Toc235630487"/>
-      <w:proofErr w:type="gramStart"/>
+      <w:bookmarkStart w:id="4" w:name="_Toc235573153"/>
       <w:r>
         <w:lastRenderedPageBreak/>
-        <w:t>The .TIR</w:t>
-      </w:r>
-      <w:proofErr w:type="gramEnd"/>
-      <w:r>
-        <w:t xml:space="preserve"> File</w:t>
+        <w:t>The .TIR File</w:t>
       </w:r>
       <w:bookmarkEnd w:id="4"/>
     </w:p>
@@ -2208,7 +2003,7 @@
       <w:pPr>
         <w:pStyle w:val="Heading3"/>
       </w:pPr>
-      <w:bookmarkStart w:id="5" w:name="_Toc235630488"/>
+      <w:bookmarkStart w:id="5" w:name="_Toc235573154"/>
       <w:r>
         <w:t>Syntax</w:t>
       </w:r>
@@ -2230,15 +2025,7 @@
     </w:p>
     <w:p>
       <w:r>
-        <w:t xml:space="preserve">To create an instance of the </w:t>
-      </w:r>
-      <w:proofErr w:type="spellStart"/>
-      <w:r>
-        <w:t>magicformula</w:t>
-      </w:r>
-      <w:proofErr w:type="spellEnd"/>
-      <w:r>
-        <w:t xml:space="preserve"> class:</w:t>
+        <w:t>To create an instance of the magicformula class:</w:t>
       </w:r>
     </w:p>
     <w:p>
@@ -2249,35 +2036,14 @@
         <w:t xml:space="preserve">&gt;&gt; </w:t>
       </w:r>
       <w:r>
-        <w:t xml:space="preserve">m = </w:t>
-      </w:r>
-      <w:proofErr w:type="spellStart"/>
-      <w:proofErr w:type="gramStart"/>
-      <w:r>
-        <w:t>magicformula</w:t>
-      </w:r>
-      <w:proofErr w:type="spellEnd"/>
-      <w:r>
-        <w:t>(</w:t>
-      </w:r>
-      <w:proofErr w:type="gramEnd"/>
-      <w:r>
-        <w:t xml:space="preserve">'Hoosier 43100 18.0x6.0-10 R20 7in </w:t>
-      </w:r>
-      <w:proofErr w:type="spellStart"/>
-      <w:r>
-        <w:t>Rim.mat</w:t>
-      </w:r>
-      <w:proofErr w:type="spellEnd"/>
-      <w:r>
-        <w:t>')</w:t>
+        <w:t>m = magicformula('Hoosier 43100 18.0x6.0-10 R20 7in Rim.mat')</w:t>
       </w:r>
     </w:p>
     <w:p>
       <w:pPr>
         <w:pStyle w:val="Heading3"/>
       </w:pPr>
-      <w:bookmarkStart w:id="6" w:name="_Toc235630489"/>
+      <w:bookmarkStart w:id="6" w:name="_Toc235573155"/>
       <w:r>
         <w:t>Force Function Syntax</w:t>
       </w:r>
@@ -2511,26 +2277,8 @@
       <w:r>
         <w:tab/>
       </w:r>
-      <w:proofErr w:type="spellStart"/>
-      <w:r>
-        <w:t>fx</w:t>
-      </w:r>
-      <w:proofErr w:type="spellEnd"/>
-      <w:r>
-        <w:t xml:space="preserve"> = </w:t>
-      </w:r>
-      <w:proofErr w:type="spellStart"/>
-      <w:proofErr w:type="gramStart"/>
-      <w:r>
-        <w:t>m.fx</w:t>
-      </w:r>
-      <w:proofErr w:type="spellEnd"/>
-      <w:r>
-        <w:t>(</w:t>
-      </w:r>
-      <w:proofErr w:type="gramEnd"/>
-      <w:r>
-        <w:t xml:space="preserve">0, </w:t>
+      <w:r>
+        <w:t xml:space="preserve">fx = m.fx(0, </w:t>
       </w:r>
       <w:r>
         <w:t>0.8</w:t>
@@ -2717,7 +2465,7 @@
       <w:pPr>
         <w:pStyle w:val="Heading2"/>
       </w:pPr>
-      <w:bookmarkStart w:id="7" w:name="_Toc235630490"/>
+      <w:bookmarkStart w:id="7" w:name="_Toc235573156"/>
       <w:r>
         <w:t>Tire Force Relationships</w:t>
       </w:r>
@@ -2732,15 +2480,7 @@
         </w:numPr>
       </w:pPr>
       <w:r>
-        <w:t xml:space="preserve">Open </w:t>
-      </w:r>
-      <w:proofErr w:type="spellStart"/>
-      <w:r>
-        <w:t>magicformula.m</w:t>
-      </w:r>
-      <w:proofErr w:type="spellEnd"/>
-      <w:r>
-        <w:t xml:space="preserve"> in MATLAB</w:t>
+        <w:t>Open magicformula.m in MATLAB</w:t>
       </w:r>
     </w:p>
     <w:p>
@@ -2767,29 +2507,11 @@
         </w:numPr>
       </w:pPr>
       <w:r>
-        <w:t xml:space="preserve">m = </w:t>
-      </w:r>
-      <w:proofErr w:type="spellStart"/>
-      <w:proofErr w:type="gramStart"/>
-      <w:r>
-        <w:t>magicformula</w:t>
-      </w:r>
-      <w:proofErr w:type="spellEnd"/>
-      <w:r>
-        <w:t>(</w:t>
-      </w:r>
-      <w:proofErr w:type="gramEnd"/>
-      <w:r>
-        <w:t>“</w:t>
-      </w:r>
-      <w:r>
-        <w:t xml:space="preserve">Hoosier 43100 18.0x6.0-10 R20 7in </w:t>
-      </w:r>
-      <w:proofErr w:type="spellStart"/>
-      <w:r>
-        <w:t>Rim.mat</w:t>
-      </w:r>
-      <w:proofErr w:type="spellEnd"/>
+        <w:t>m = magicformula(“</w:t>
+      </w:r>
+      <w:r>
+        <w:t>Hoosier 43100 18.0x6.0-10 R20 7in Rim.mat</w:t>
+      </w:r>
       <w:r>
         <w:t>”)</w:t>
       </w:r>
@@ -2901,7 +2623,7 @@
       <w:pPr>
         <w:pStyle w:val="Heading3"/>
       </w:pPr>
-      <w:bookmarkStart w:id="8" w:name="_Toc235630491"/>
+      <w:bookmarkStart w:id="8" w:name="_Toc235573157"/>
       <w:r>
         <w:t>Lateral Force vs Slip Angle and Normal Force</w:t>
       </w:r>
@@ -3012,7 +2734,7 @@
       <w:pPr>
         <w:pStyle w:val="Heading1"/>
       </w:pPr>
-      <w:bookmarkStart w:id="9" w:name="_Toc235630492"/>
+      <w:bookmarkStart w:id="9" w:name="_Toc235573158"/>
       <w:r>
         <w:lastRenderedPageBreak/>
         <w:t>The Bicycle Model</w:t>
@@ -3181,7 +2903,7 @@
       <w:pPr>
         <w:pStyle w:val="Heading1"/>
       </w:pPr>
-      <w:bookmarkStart w:id="10" w:name="_Toc235630493"/>
+      <w:bookmarkStart w:id="10" w:name="_Toc235573159"/>
       <w:r>
         <w:t>Control &amp; Stability</w:t>
       </w:r>
@@ -3484,13 +3206,8 @@
               <w:t>Distance from r</w:t>
             </w:r>
             <w:r>
-              <w:t xml:space="preserve">ear tire to </w:t>
-            </w:r>
-            <w:proofErr w:type="spellStart"/>
-            <w:r>
-              <w:t>CoG</w:t>
-            </w:r>
-            <w:proofErr w:type="spellEnd"/>
+              <w:t>ear tire to CoG</w:t>
+            </w:r>
           </w:p>
         </w:tc>
       </w:tr>
@@ -3526,13 +3243,8 @@
               <w:t>Distance from f</w:t>
             </w:r>
             <w:r>
-              <w:t xml:space="preserve">ront tire to </w:t>
-            </w:r>
-            <w:proofErr w:type="spellStart"/>
-            <w:r>
-              <w:t>CoG</w:t>
-            </w:r>
-            <w:proofErr w:type="spellEnd"/>
+              <w:t>ront tire to CoG</w:t>
+            </w:r>
           </w:p>
         </w:tc>
       </w:tr>
@@ -3751,7 +3463,7 @@
       <w:pPr>
         <w:pStyle w:val="Heading2"/>
       </w:pPr>
-      <w:bookmarkStart w:id="11" w:name="_Toc235630494"/>
+      <w:bookmarkStart w:id="11" w:name="_Toc235573160"/>
       <w:r>
         <w:t>Slip Angle Derivation</w:t>
       </w:r>
@@ -4822,21 +4534,7 @@
         <w:rPr>
           <w:rFonts w:eastAsiaTheme="minorEastAsia"/>
         </w:rPr>
-        <w:t xml:space="preserve">The yawing moment is the sum of the moments </w:t>
-      </w:r>
-      <w:proofErr w:type="gramStart"/>
-      <w:r>
-        <w:rPr>
-          <w:rFonts w:eastAsiaTheme="minorEastAsia"/>
-        </w:rPr>
-        <w:t>about</w:t>
-      </w:r>
-      <w:proofErr w:type="gramEnd"/>
-      <w:r>
-        <w:rPr>
-          <w:rFonts w:eastAsiaTheme="minorEastAsia"/>
-        </w:rPr>
-        <w:t xml:space="preserve"> the center of gravity:</w:t>
+        <w:t>The yawing moment is the sum of the moments about the center of gravity:</w:t>
       </w:r>
     </w:p>
     <w:p>
@@ -4913,7 +4611,7 @@
       <w:pPr>
         <w:pStyle w:val="Heading2"/>
       </w:pPr>
-      <w:bookmarkStart w:id="12" w:name="_Toc235630495"/>
+      <w:bookmarkStart w:id="12" w:name="_Toc235573161"/>
       <w:r>
         <w:t>Summary of Slip Angle Derivation</w:t>
       </w:r>
@@ -5399,7 +5097,7 @@
       <w:pPr>
         <w:pStyle w:val="Heading2"/>
       </w:pPr>
-      <w:bookmarkStart w:id="13" w:name="_Toc235630496"/>
+      <w:bookmarkStart w:id="13" w:name="_Toc235573162"/>
       <w:r>
         <w:t>Control &amp; Stability Derivatives</w:t>
       </w:r>
@@ -7637,7 +7335,7 @@
           <w:rFonts w:eastAsiaTheme="minorEastAsia"/>
         </w:rPr>
       </w:pPr>
-      <w:bookmarkStart w:id="14" w:name="_Toc235630497"/>
+      <w:bookmarkStart w:id="14" w:name="_Toc235573163"/>
       <w:r>
         <w:rPr>
           <w:rFonts w:eastAsiaTheme="minorEastAsia"/>
@@ -8044,11 +7742,9 @@
       <w:pPr>
         <w:pStyle w:val="Heading1"/>
       </w:pPr>
-      <w:bookmarkStart w:id="15" w:name="_Toc235630498"/>
       <w:r>
         <w:t>Virtual Model</w:t>
       </w:r>
-      <w:bookmarkEnd w:id="15"/>
     </w:p>
     <w:p>
       <w:r>
@@ -8298,13 +7994,8 @@
       <w:r>
         <w:t xml:space="preserve">requires </w:t>
       </w:r>
-      <w:proofErr w:type="gramStart"/>
-      <w:r>
-        <w:t>all of</w:t>
-      </w:r>
-      <w:proofErr w:type="gramEnd"/>
-      <w:r>
-        <w:t xml:space="preserve"> </w:t>
+      <w:r>
+        <w:t xml:space="preserve">all of </w:t>
       </w:r>
       <m:oMath>
         <m:r>
@@ -8596,15 +8287,12 @@
     </w:p>
     <w:p>
       <w:r>
-        <w:rPr>
-          <w:noProof/>
-        </w:rPr>
         <w:lastRenderedPageBreak/>
         <w:drawing>
-          <wp:inline distT="0" distB="0" distL="0" distR="0" wp14:anchorId="5631CA4C" wp14:editId="156E8B7F">
-            <wp:extent cx="5943600" cy="4157345"/>
+          <wp:inline distT="0" distB="0" distL="0" distR="0" wp14:anchorId="05416E7D" wp14:editId="6AEE5EBE">
+            <wp:extent cx="5943600" cy="4060190"/>
             <wp:effectExtent l="0" t="0" r="0" b="0"/>
-            <wp:docPr id="1033184715" name="Picture 1"/>
+            <wp:docPr id="1114758606" name="Picture 1"/>
             <wp:cNvGraphicFramePr>
               <a:graphicFrameLocks xmlns:a="http://schemas.openxmlformats.org/drawingml/2006/main" noChangeAspect="1"/>
             </wp:cNvGraphicFramePr>
@@ -8612,7 +8300,7 @@
               <a:graphicData uri="http://schemas.openxmlformats.org/drawingml/2006/picture">
                 <pic:pic xmlns:pic="http://schemas.openxmlformats.org/drawingml/2006/picture">
                   <pic:nvPicPr>
-                    <pic:cNvPr id="1033184715" name=""/>
+                    <pic:cNvPr id="1114758606" name=""/>
                     <pic:cNvPicPr/>
                   </pic:nvPicPr>
                   <pic:blipFill>
@@ -8624,7 +8312,7 @@
                   <pic:spPr>
                     <a:xfrm>
                       <a:off x="0" y="0"/>
-                      <a:ext cx="5943600" cy="4157345"/>
+                      <a:ext cx="5943600" cy="4060190"/>
                     </a:xfrm>
                     <a:prstGeom prst="rect">
                       <a:avLst/>
@@ -8864,14 +8552,12 @@
           <w:rFonts w:eastAsiaTheme="minorEastAsia"/>
         </w:rPr>
       </w:pPr>
-      <w:bookmarkStart w:id="16" w:name="_Toc235630499"/>
       <w:r>
         <w:rPr>
           <w:rFonts w:eastAsiaTheme="minorEastAsia"/>
         </w:rPr>
         <w:t>Influence of Center of Gravity Location</w:t>
       </w:r>
-      <w:bookmarkEnd w:id="16"/>
     </w:p>
     <w:p>
       <w:pPr>
@@ -8913,21 +8599,7 @@
         <w:rPr>
           <w:rFonts w:eastAsiaTheme="minorEastAsia"/>
         </w:rPr>
-        <w:t xml:space="preserve">Change </w:t>
-      </w:r>
-      <w:proofErr w:type="spellStart"/>
-      <w:r>
-        <w:rPr>
-          <w:rFonts w:eastAsiaTheme="minorEastAsia"/>
-        </w:rPr>
-        <w:t>wt_pct_front</w:t>
-      </w:r>
-      <w:proofErr w:type="spellEnd"/>
-      <w:r>
-        <w:rPr>
-          <w:rFonts w:eastAsiaTheme="minorEastAsia"/>
-        </w:rPr>
-        <w:t xml:space="preserve"> on line 16 of your script</w:t>
+        <w:t>Change wt_pct_front on line 16 of your script</w:t>
       </w:r>
       <w:r>
         <w:rPr>
@@ -9119,7 +8791,7 @@
       <w:pPr>
         <w:pStyle w:val="Heading1"/>
       </w:pPr>
-      <w:bookmarkStart w:id="17" w:name="_Toc235630500"/>
+      <w:bookmarkStart w:id="15" w:name="_Toc235573165"/>
       <w:r>
         <w:lastRenderedPageBreak/>
         <w:t>Reflection</w:t>
@@ -9127,7 +8799,6 @@
       <w:r>
         <w:t xml:space="preserve"> Questions</w:t>
       </w:r>
-      <w:bookmarkEnd w:id="17"/>
     </w:p>
     <w:p>
       <w:pPr>
@@ -9309,12 +8980,11 @@
       <w:pPr>
         <w:pStyle w:val="Heading1"/>
       </w:pPr>
-      <w:bookmarkStart w:id="18" w:name="_Toc235630501"/>
       <w:r>
         <w:lastRenderedPageBreak/>
         <w:t>References</w:t>
       </w:r>
-      <w:bookmarkEnd w:id="18"/>
+      <w:bookmarkEnd w:id="15"/>
     </w:p>
     <w:p>
       <w:r>
@@ -9328,15 +8998,7 @@
         <w:t>Tire and vehicle dynamics (third edition)</w:t>
       </w:r>
       <w:r>
-        <w:t xml:space="preserve">, Third Edition., Oxford: Butterworth-Heinemann, 2012, p. 609. </w:t>
-      </w:r>
-      <w:proofErr w:type="spellStart"/>
-      <w:r>
-        <w:t>doi</w:t>
-      </w:r>
-      <w:proofErr w:type="spellEnd"/>
-      <w:r>
-        <w:t xml:space="preserve">: </w:t>
+        <w:t xml:space="preserve">, Third Edition., Oxford: Butterworth-Heinemann, 2012, p. 609. doi: </w:t>
       </w:r>
       <w:hyperlink r:id="rId32" w:history="1">
         <w:r>
@@ -9355,15 +9017,7 @@
         <w:t xml:space="preserve">[2] </w:t>
       </w:r>
       <w:r>
-        <w:t xml:space="preserve">Besselink, I. J. M., Schmeitz, A. J. C., &amp; </w:t>
-      </w:r>
-      <w:proofErr w:type="spellStart"/>
-      <w:r>
-        <w:t>Pacejka</w:t>
-      </w:r>
-      <w:proofErr w:type="spellEnd"/>
-      <w:r>
-        <w:t xml:space="preserve">, H. B. (2010). An improved Magic Formula/Swift tyre model that can handle inflation pressure changes. </w:t>
+        <w:t xml:space="preserve">Besselink, I. J. M., Schmeitz, A. J. C., &amp; Pacejka, H. B. (2010). An improved Magic Formula/Swift tyre model that can handle inflation pressure changes. </w:t>
       </w:r>
       <w:r>
         <w:rPr>
@@ -9462,7 +9116,7 @@
           <w:noProof/>
         </w:rPr>
         <w:drawing>
-          <wp:inline distT="0" distB="0" distL="0" distR="0" wp14:anchorId="0AD6BBF3" wp14:editId="16C415EE">
+          <wp:inline distT="0" distB="0" distL="0" distR="0" wp14:anchorId="0AD6BBF3" wp14:editId="675B6CAA">
             <wp:extent cx="5926455" cy="3950970"/>
             <wp:effectExtent l="0" t="0" r="0" b="0"/>
             <wp:docPr id="1698181436" name="Picture 1"/>

</xml_diff>